<commit_message>
Committing updated document file
</commit_message>
<xml_diff>
--- a/Product_Management_API.docx
+++ b/Product_Management_API.docx
@@ -14,6 +14,642 @@
         </w:rPr>
         <w:t>Product Management API</w:t>
       </w:r>
+    </w:p>
+    <w:p>
+      <w:pPr>
+        <w:rPr>
+          <w:lang w:val="en-US"/>
+        </w:rPr>
+      </w:pPr>
+      <w:r>
+        <w:rPr>
+          <w:lang w:val="en-US"/>
+        </w:rPr>
+        <w:t>Tested on Postman</w:t>
+      </w:r>
+    </w:p>
+    <w:p>
+      <w:pPr>
+        <w:pStyle w:val="ListParagraph"/>
+        <w:numPr>
+          <w:ilvl w:val="0"/>
+          <w:numId w:val="1"/>
+        </w:numPr>
+        <w:rPr>
+          <w:lang w:val="en-US"/>
+        </w:rPr>
+      </w:pPr>
+      <w:r>
+        <w:rPr>
+          <w:lang w:val="en-US"/>
+        </w:rPr>
+        <w:t>Get all products</w:t>
+      </w:r>
+    </w:p>
+    <w:p>
+      <w:pPr>
+        <w:rPr>
+          <w:lang w:val="en-US"/>
+        </w:rPr>
+      </w:pPr>
+      <w:r>
+        <w:rPr>
+          <w:lang w:val="en-US"/>
+        </w:rPr>
+        <w:drawing>
+          <wp:inline distT="0" distB="0" distL="0" distR="0" wp14:anchorId="0E8C05EF" wp14:editId="687147C0">
+            <wp:extent cx="5731510" cy="2792095"/>
+            <wp:effectExtent l="19050" t="19050" r="21590" b="27305"/>
+            <wp:docPr id="785702031" name="Picture 1"/>
+            <wp:cNvGraphicFramePr>
+              <a:graphicFrameLocks xmlns:a="http://schemas.openxmlformats.org/drawingml/2006/main" noChangeAspect="1"/>
+            </wp:cNvGraphicFramePr>
+            <a:graphic xmlns:a="http://schemas.openxmlformats.org/drawingml/2006/main">
+              <a:graphicData uri="http://schemas.openxmlformats.org/drawingml/2006/picture">
+                <pic:pic xmlns:pic="http://schemas.openxmlformats.org/drawingml/2006/picture">
+                  <pic:nvPicPr>
+                    <pic:cNvPr id="785702031" name=""/>
+                    <pic:cNvPicPr/>
+                  </pic:nvPicPr>
+                  <pic:blipFill>
+                    <a:blip r:embed="rId5"/>
+                    <a:stretch>
+                      <a:fillRect/>
+                    </a:stretch>
+                  </pic:blipFill>
+                  <pic:spPr>
+                    <a:xfrm>
+                      <a:off x="0" y="0"/>
+                      <a:ext cx="5731510" cy="2792095"/>
+                    </a:xfrm>
+                    <a:prstGeom prst="rect">
+                      <a:avLst/>
+                    </a:prstGeom>
+                    <a:ln>
+                      <a:solidFill>
+                        <a:schemeClr val="tx1"/>
+                      </a:solidFill>
+                    </a:ln>
+                  </pic:spPr>
+                </pic:pic>
+              </a:graphicData>
+            </a:graphic>
+          </wp:inline>
+        </w:drawing>
+      </w:r>
+    </w:p>
+    <w:p>
+      <w:pPr>
+        <w:pStyle w:val="ListParagraph"/>
+        <w:numPr>
+          <w:ilvl w:val="0"/>
+          <w:numId w:val="1"/>
+        </w:numPr>
+        <w:rPr>
+          <w:lang w:val="en-US"/>
+        </w:rPr>
+      </w:pPr>
+      <w:r>
+        <w:rPr>
+          <w:lang w:val="en-US"/>
+        </w:rPr>
+        <w:t>Create Product</w:t>
+      </w:r>
+    </w:p>
+    <w:p>
+      <w:pPr>
+        <w:rPr>
+          <w:lang w:val="en-US"/>
+        </w:rPr>
+      </w:pPr>
+      <w:r>
+        <w:rPr>
+          <w:lang w:val="en-US"/>
+        </w:rPr>
+        <w:drawing>
+          <wp:inline distT="0" distB="0" distL="0" distR="0" wp14:anchorId="08868CCC" wp14:editId="0E172486">
+            <wp:extent cx="5731510" cy="2102485"/>
+            <wp:effectExtent l="19050" t="19050" r="21590" b="12065"/>
+            <wp:docPr id="1023692527" name="Picture 1"/>
+            <wp:cNvGraphicFramePr>
+              <a:graphicFrameLocks xmlns:a="http://schemas.openxmlformats.org/drawingml/2006/main" noChangeAspect="1"/>
+            </wp:cNvGraphicFramePr>
+            <a:graphic xmlns:a="http://schemas.openxmlformats.org/drawingml/2006/main">
+              <a:graphicData uri="http://schemas.openxmlformats.org/drawingml/2006/picture">
+                <pic:pic xmlns:pic="http://schemas.openxmlformats.org/drawingml/2006/picture">
+                  <pic:nvPicPr>
+                    <pic:cNvPr id="1023692527" name=""/>
+                    <pic:cNvPicPr/>
+                  </pic:nvPicPr>
+                  <pic:blipFill>
+                    <a:blip r:embed="rId6"/>
+                    <a:stretch>
+                      <a:fillRect/>
+                    </a:stretch>
+                  </pic:blipFill>
+                  <pic:spPr>
+                    <a:xfrm>
+                      <a:off x="0" y="0"/>
+                      <a:ext cx="5731510" cy="2102485"/>
+                    </a:xfrm>
+                    <a:prstGeom prst="rect">
+                      <a:avLst/>
+                    </a:prstGeom>
+                    <a:ln>
+                      <a:solidFill>
+                        <a:schemeClr val="tx1"/>
+                      </a:solidFill>
+                    </a:ln>
+                  </pic:spPr>
+                </pic:pic>
+              </a:graphicData>
+            </a:graphic>
+          </wp:inline>
+        </w:drawing>
+      </w:r>
+    </w:p>
+    <w:p>
+      <w:pPr>
+        <w:pStyle w:val="ListParagraph"/>
+        <w:numPr>
+          <w:ilvl w:val="0"/>
+          <w:numId w:val="1"/>
+        </w:numPr>
+        <w:rPr>
+          <w:lang w:val="en-US"/>
+        </w:rPr>
+      </w:pPr>
+      <w:r>
+        <w:rPr>
+          <w:lang w:val="en-US"/>
+        </w:rPr>
+        <w:t>Get Product by Id</w:t>
+      </w:r>
+    </w:p>
+    <w:p>
+      <w:pPr>
+        <w:rPr>
+          <w:lang w:val="en-US"/>
+        </w:rPr>
+      </w:pPr>
+      <w:r>
+        <w:rPr>
+          <w:lang w:val="en-US"/>
+        </w:rPr>
+        <w:drawing>
+          <wp:inline distT="0" distB="0" distL="0" distR="0" wp14:anchorId="2FC5BFC0" wp14:editId="5E661C1A">
+            <wp:extent cx="5490210" cy="2005454"/>
+            <wp:effectExtent l="19050" t="19050" r="15240" b="13970"/>
+            <wp:docPr id="1168565356" name="Picture 1"/>
+            <wp:cNvGraphicFramePr>
+              <a:graphicFrameLocks xmlns:a="http://schemas.openxmlformats.org/drawingml/2006/main" noChangeAspect="1"/>
+            </wp:cNvGraphicFramePr>
+            <a:graphic xmlns:a="http://schemas.openxmlformats.org/drawingml/2006/main">
+              <a:graphicData uri="http://schemas.openxmlformats.org/drawingml/2006/picture">
+                <pic:pic xmlns:pic="http://schemas.openxmlformats.org/drawingml/2006/picture">
+                  <pic:nvPicPr>
+                    <pic:cNvPr id="1168565356" name=""/>
+                    <pic:cNvPicPr/>
+                  </pic:nvPicPr>
+                  <pic:blipFill>
+                    <a:blip r:embed="rId7"/>
+                    <a:stretch>
+                      <a:fillRect/>
+                    </a:stretch>
+                  </pic:blipFill>
+                  <pic:spPr>
+                    <a:xfrm>
+                      <a:off x="0" y="0"/>
+                      <a:ext cx="5494875" cy="2007158"/>
+                    </a:xfrm>
+                    <a:prstGeom prst="rect">
+                      <a:avLst/>
+                    </a:prstGeom>
+                    <a:ln>
+                      <a:solidFill>
+                        <a:schemeClr val="tx1"/>
+                      </a:solidFill>
+                    </a:ln>
+                  </pic:spPr>
+                </pic:pic>
+              </a:graphicData>
+            </a:graphic>
+          </wp:inline>
+        </w:drawing>
+      </w:r>
+    </w:p>
+    <w:p>
+      <w:pPr>
+        <w:pStyle w:val="ListParagraph"/>
+        <w:numPr>
+          <w:ilvl w:val="0"/>
+          <w:numId w:val="1"/>
+        </w:numPr>
+        <w:rPr>
+          <w:lang w:val="en-US"/>
+        </w:rPr>
+      </w:pPr>
+      <w:r>
+        <w:rPr>
+          <w:lang w:val="en-US"/>
+        </w:rPr>
+        <w:lastRenderedPageBreak/>
+        <w:t>Update Product</w:t>
+      </w:r>
+    </w:p>
+    <w:p>
+      <w:pPr>
+        <w:rPr>
+          <w:lang w:val="en-US"/>
+        </w:rPr>
+      </w:pPr>
+      <w:r>
+        <w:rPr>
+          <w:lang w:val="en-US"/>
+        </w:rPr>
+        <w:drawing>
+          <wp:inline distT="0" distB="0" distL="0" distR="0" wp14:anchorId="1480E662" wp14:editId="0CBE2177">
+            <wp:extent cx="5731510" cy="2232025"/>
+            <wp:effectExtent l="19050" t="19050" r="21590" b="15875"/>
+            <wp:docPr id="1574727652" name="Picture 1"/>
+            <wp:cNvGraphicFramePr>
+              <a:graphicFrameLocks xmlns:a="http://schemas.openxmlformats.org/drawingml/2006/main" noChangeAspect="1"/>
+            </wp:cNvGraphicFramePr>
+            <a:graphic xmlns:a="http://schemas.openxmlformats.org/drawingml/2006/main">
+              <a:graphicData uri="http://schemas.openxmlformats.org/drawingml/2006/picture">
+                <pic:pic xmlns:pic="http://schemas.openxmlformats.org/drawingml/2006/picture">
+                  <pic:nvPicPr>
+                    <pic:cNvPr id="1574727652" name=""/>
+                    <pic:cNvPicPr/>
+                  </pic:nvPicPr>
+                  <pic:blipFill>
+                    <a:blip r:embed="rId8"/>
+                    <a:stretch>
+                      <a:fillRect/>
+                    </a:stretch>
+                  </pic:blipFill>
+                  <pic:spPr>
+                    <a:xfrm>
+                      <a:off x="0" y="0"/>
+                      <a:ext cx="5731510" cy="2232025"/>
+                    </a:xfrm>
+                    <a:prstGeom prst="rect">
+                      <a:avLst/>
+                    </a:prstGeom>
+                    <a:ln>
+                      <a:solidFill>
+                        <a:schemeClr val="tx1"/>
+                      </a:solidFill>
+                    </a:ln>
+                  </pic:spPr>
+                </pic:pic>
+              </a:graphicData>
+            </a:graphic>
+          </wp:inline>
+        </w:drawing>
+      </w:r>
+    </w:p>
+    <w:p>
+      <w:pPr>
+        <w:pStyle w:val="ListParagraph"/>
+        <w:numPr>
+          <w:ilvl w:val="0"/>
+          <w:numId w:val="1"/>
+        </w:numPr>
+        <w:rPr>
+          <w:lang w:val="en-US"/>
+        </w:rPr>
+      </w:pPr>
+      <w:r>
+        <w:rPr>
+          <w:lang w:val="en-US"/>
+        </w:rPr>
+        <w:t xml:space="preserve">Check Stock </w:t>
+      </w:r>
+      <w:r>
+        <w:rPr>
+          <w:lang w:val="en-US"/>
+        </w:rPr>
+        <w:t>availability</w:t>
+      </w:r>
+    </w:p>
+    <w:p>
+      <w:pPr>
+        <w:rPr>
+          <w:lang w:val="en-US"/>
+        </w:rPr>
+      </w:pPr>
+      <w:r>
+        <w:rPr>
+          <w:lang w:val="en-US"/>
+        </w:rPr>
+        <w:drawing>
+          <wp:inline distT="0" distB="0" distL="0" distR="0" wp14:anchorId="6883D340" wp14:editId="5FA2D99E">
+            <wp:extent cx="5731510" cy="2015490"/>
+            <wp:effectExtent l="19050" t="19050" r="21590" b="22860"/>
+            <wp:docPr id="1289088199" name="Picture 1"/>
+            <wp:cNvGraphicFramePr>
+              <a:graphicFrameLocks xmlns:a="http://schemas.openxmlformats.org/drawingml/2006/main" noChangeAspect="1"/>
+            </wp:cNvGraphicFramePr>
+            <a:graphic xmlns:a="http://schemas.openxmlformats.org/drawingml/2006/main">
+              <a:graphicData uri="http://schemas.openxmlformats.org/drawingml/2006/picture">
+                <pic:pic xmlns:pic="http://schemas.openxmlformats.org/drawingml/2006/picture">
+                  <pic:nvPicPr>
+                    <pic:cNvPr id="1289088199" name=""/>
+                    <pic:cNvPicPr/>
+                  </pic:nvPicPr>
+                  <pic:blipFill>
+                    <a:blip r:embed="rId9"/>
+                    <a:stretch>
+                      <a:fillRect/>
+                    </a:stretch>
+                  </pic:blipFill>
+                  <pic:spPr>
+                    <a:xfrm>
+                      <a:off x="0" y="0"/>
+                      <a:ext cx="5731510" cy="2015490"/>
+                    </a:xfrm>
+                    <a:prstGeom prst="rect">
+                      <a:avLst/>
+                    </a:prstGeom>
+                    <a:ln>
+                      <a:solidFill>
+                        <a:schemeClr val="tx1"/>
+                      </a:solidFill>
+                    </a:ln>
+                  </pic:spPr>
+                </pic:pic>
+              </a:graphicData>
+            </a:graphic>
+          </wp:inline>
+        </w:drawing>
+      </w:r>
+    </w:p>
+    <w:p>
+      <w:pPr>
+        <w:pStyle w:val="ListParagraph"/>
+        <w:numPr>
+          <w:ilvl w:val="0"/>
+          <w:numId w:val="1"/>
+        </w:numPr>
+        <w:rPr>
+          <w:lang w:val="en-US"/>
+        </w:rPr>
+      </w:pPr>
+      <w:r>
+        <w:rPr>
+          <w:lang w:val="en-US"/>
+        </w:rPr>
+        <w:t>Delete Product by Id</w:t>
+      </w:r>
+    </w:p>
+    <w:p>
+      <w:pPr>
+        <w:rPr>
+          <w:lang w:val="en-US"/>
+        </w:rPr>
+      </w:pPr>
+      <w:r>
+        <w:rPr>
+          <w:lang w:val="en-US"/>
+        </w:rPr>
+        <w:drawing>
+          <wp:inline distT="0" distB="0" distL="0" distR="0" wp14:anchorId="1344039D" wp14:editId="7D19F2A0">
+            <wp:extent cx="5731510" cy="1784985"/>
+            <wp:effectExtent l="19050" t="19050" r="21590" b="24765"/>
+            <wp:docPr id="1333431907" name="Picture 1"/>
+            <wp:cNvGraphicFramePr>
+              <a:graphicFrameLocks xmlns:a="http://schemas.openxmlformats.org/drawingml/2006/main" noChangeAspect="1"/>
+            </wp:cNvGraphicFramePr>
+            <a:graphic xmlns:a="http://schemas.openxmlformats.org/drawingml/2006/main">
+              <a:graphicData uri="http://schemas.openxmlformats.org/drawingml/2006/picture">
+                <pic:pic xmlns:pic="http://schemas.openxmlformats.org/drawingml/2006/picture">
+                  <pic:nvPicPr>
+                    <pic:cNvPr id="1333431907" name=""/>
+                    <pic:cNvPicPr/>
+                  </pic:nvPicPr>
+                  <pic:blipFill>
+                    <a:blip r:embed="rId10"/>
+                    <a:stretch>
+                      <a:fillRect/>
+                    </a:stretch>
+                  </pic:blipFill>
+                  <pic:spPr>
+                    <a:xfrm>
+                      <a:off x="0" y="0"/>
+                      <a:ext cx="5731510" cy="1784985"/>
+                    </a:xfrm>
+                    <a:prstGeom prst="rect">
+                      <a:avLst/>
+                    </a:prstGeom>
+                    <a:ln>
+                      <a:solidFill>
+                        <a:schemeClr val="tx1"/>
+                      </a:solidFill>
+                    </a:ln>
+                  </pic:spPr>
+                </pic:pic>
+              </a:graphicData>
+            </a:graphic>
+          </wp:inline>
+        </w:drawing>
+      </w:r>
+    </w:p>
+    <w:p>
+      <w:pPr>
+        <w:rPr>
+          <w:lang w:val="en-US"/>
+        </w:rPr>
+      </w:pPr>
+    </w:p>
+    <w:p>
+      <w:pPr>
+        <w:rPr>
+          <w:lang w:val="en-US"/>
+        </w:rPr>
+      </w:pPr>
+    </w:p>
+    <w:p>
+      <w:pPr>
+        <w:rPr>
+          <w:lang w:val="en-US"/>
+        </w:rPr>
+      </w:pPr>
+    </w:p>
+    <w:p>
+      <w:pPr>
+        <w:rPr>
+          <w:lang w:val="en-US"/>
+        </w:rPr>
+      </w:pPr>
+    </w:p>
+    <w:p>
+      <w:pPr>
+        <w:pStyle w:val="ListParagraph"/>
+        <w:numPr>
+          <w:ilvl w:val="0"/>
+          <w:numId w:val="1"/>
+        </w:numPr>
+        <w:rPr>
+          <w:lang w:val="en-US"/>
+        </w:rPr>
+      </w:pPr>
+      <w:r>
+        <w:rPr>
+          <w:lang w:val="en-US"/>
+        </w:rPr>
+        <w:lastRenderedPageBreak/>
+        <w:t>G</w:t>
+      </w:r>
+      <w:r>
+        <w:rPr>
+          <w:lang w:val="en-US"/>
+        </w:rPr>
+        <w:t>et product sorted by price</w:t>
+      </w:r>
+    </w:p>
+    <w:p>
+      <w:pPr>
+        <w:rPr>
+          <w:lang w:val="en-US"/>
+        </w:rPr>
+      </w:pPr>
+      <w:r>
+        <w:rPr>
+          <w:lang w:val="en-US"/>
+        </w:rPr>
+        <w:drawing>
+          <wp:inline distT="0" distB="0" distL="0" distR="0" wp14:anchorId="58073326" wp14:editId="695BB761">
+            <wp:extent cx="5731510" cy="2795905"/>
+            <wp:effectExtent l="19050" t="19050" r="21590" b="23495"/>
+            <wp:docPr id="31850551" name="Picture 1"/>
+            <wp:cNvGraphicFramePr>
+              <a:graphicFrameLocks xmlns:a="http://schemas.openxmlformats.org/drawingml/2006/main" noChangeAspect="1"/>
+            </wp:cNvGraphicFramePr>
+            <a:graphic xmlns:a="http://schemas.openxmlformats.org/drawingml/2006/main">
+              <a:graphicData uri="http://schemas.openxmlformats.org/drawingml/2006/picture">
+                <pic:pic xmlns:pic="http://schemas.openxmlformats.org/drawingml/2006/picture">
+                  <pic:nvPicPr>
+                    <pic:cNvPr id="31850551" name=""/>
+                    <pic:cNvPicPr/>
+                  </pic:nvPicPr>
+                  <pic:blipFill>
+                    <a:blip r:embed="rId11"/>
+                    <a:stretch>
+                      <a:fillRect/>
+                    </a:stretch>
+                  </pic:blipFill>
+                  <pic:spPr>
+                    <a:xfrm>
+                      <a:off x="0" y="0"/>
+                      <a:ext cx="5731510" cy="2795905"/>
+                    </a:xfrm>
+                    <a:prstGeom prst="rect">
+                      <a:avLst/>
+                    </a:prstGeom>
+                    <a:ln>
+                      <a:solidFill>
+                        <a:schemeClr val="tx1"/>
+                      </a:solidFill>
+                    </a:ln>
+                  </pic:spPr>
+                </pic:pic>
+              </a:graphicData>
+            </a:graphic>
+          </wp:inline>
+        </w:drawing>
+      </w:r>
+    </w:p>
+    <w:p>
+      <w:pPr>
+        <w:pStyle w:val="ListParagraph"/>
+        <w:numPr>
+          <w:ilvl w:val="0"/>
+          <w:numId w:val="1"/>
+        </w:numPr>
+        <w:rPr>
+          <w:lang w:val="en-US"/>
+        </w:rPr>
+      </w:pPr>
+      <w:r>
+        <w:rPr>
+          <w:lang w:val="en-US"/>
+        </w:rPr>
+        <w:t>Pagination</w:t>
+      </w:r>
+    </w:p>
+    <w:p>
+      <w:pPr>
+        <w:rPr>
+          <w:lang w:val="en-US"/>
+        </w:rPr>
+      </w:pPr>
+      <w:r>
+        <w:rPr>
+          <w:lang w:val="en-US"/>
+        </w:rPr>
+        <w:drawing>
+          <wp:inline distT="0" distB="0" distL="0" distR="0" wp14:anchorId="1F6CBE74" wp14:editId="2B4BBF3C">
+            <wp:extent cx="5731510" cy="2806700"/>
+            <wp:effectExtent l="19050" t="19050" r="21590" b="12700"/>
+            <wp:docPr id="1237710536" name="Picture 1"/>
+            <wp:cNvGraphicFramePr>
+              <a:graphicFrameLocks xmlns:a="http://schemas.openxmlformats.org/drawingml/2006/main" noChangeAspect="1"/>
+            </wp:cNvGraphicFramePr>
+            <a:graphic xmlns:a="http://schemas.openxmlformats.org/drawingml/2006/main">
+              <a:graphicData uri="http://schemas.openxmlformats.org/drawingml/2006/picture">
+                <pic:pic xmlns:pic="http://schemas.openxmlformats.org/drawingml/2006/picture">
+                  <pic:nvPicPr>
+                    <pic:cNvPr id="1237710536" name=""/>
+                    <pic:cNvPicPr/>
+                  </pic:nvPicPr>
+                  <pic:blipFill>
+                    <a:blip r:embed="rId12"/>
+                    <a:stretch>
+                      <a:fillRect/>
+                    </a:stretch>
+                  </pic:blipFill>
+                  <pic:spPr>
+                    <a:xfrm>
+                      <a:off x="0" y="0"/>
+                      <a:ext cx="5731510" cy="2806700"/>
+                    </a:xfrm>
+                    <a:prstGeom prst="rect">
+                      <a:avLst/>
+                    </a:prstGeom>
+                    <a:ln>
+                      <a:solidFill>
+                        <a:schemeClr val="tx1"/>
+                      </a:solidFill>
+                    </a:ln>
+                  </pic:spPr>
+                </pic:pic>
+              </a:graphicData>
+            </a:graphic>
+          </wp:inline>
+        </w:drawing>
+      </w:r>
+    </w:p>
+    <w:p>
+      <w:pPr>
+        <w:rPr>
+          <w:lang w:val="en-US"/>
+        </w:rPr>
+      </w:pPr>
+    </w:p>
+    <w:p>
+      <w:pPr>
+        <w:rPr>
+          <w:lang w:val="en-US"/>
+        </w:rPr>
+      </w:pPr>
+    </w:p>
+    <w:p>
+      <w:pPr>
+        <w:rPr>
+          <w:lang w:val="en-US"/>
+        </w:rPr>
+      </w:pPr>
     </w:p>
     <w:p>
       <w:r>
@@ -50,10 +686,10 @@
             <v:path o:extrusionok="f" gradientshapeok="t" o:connecttype="rect"/>
             <o:lock v:ext="edit" aspectratio="t"/>
           </v:shapetype>
-          <v:shape id="_x0000_i1025" type="#_x0000_t75" style="width:75.85pt;height:49.3pt" o:ole="">
-            <v:imagedata r:id="rId4" o:title=""/>
+          <v:shape id="_x0000_i1025" type="#_x0000_t75" style="width:75.6pt;height:49.2pt" o:ole="">
+            <v:imagedata r:id="rId13" o:title=""/>
           </v:shape>
-          <o:OLEObject Type="Embed" ProgID="Package" ShapeID="_x0000_i1025" DrawAspect="Icon" ObjectID="_1824840973" r:id="rId5"/>
+          <o:OLEObject Type="Embed" ProgID="Package" ShapeID="_x0000_i1025" DrawAspect="Icon" ObjectID="_1824843594" r:id="rId14"/>
         </w:object>
       </w:r>
     </w:p>
@@ -62,6 +698,7 @@
         <w:rPr>
           <w:lang w:val="en-US"/>
         </w:rPr>
+        <w:lastRenderedPageBreak/>
         <w:t>Swagger UI</w:t>
       </w:r>
       <w:r>
@@ -70,7 +707,7 @@
         </w:rPr>
         <w:br/>
       </w:r>
-      <w:hyperlink r:id="rId6" w:history="1">
+      <w:hyperlink r:id="rId15" w:history="1">
         <w:r>
           <w:rPr>
             <w:rStyle w:val="Hyperlink"/>
@@ -87,6 +724,7 @@
       </w:pPr>
       <w:r>
         <w:rPr>
+          <w:noProof/>
           <w:lang w:val="en-US"/>
         </w:rPr>
         <w:drawing>
@@ -105,7 +743,7 @@
                     <pic:cNvPicPr/>
                   </pic:nvPicPr>
                   <pic:blipFill>
-                    <a:blip r:embed="rId7"/>
+                    <a:blip r:embed="rId16"/>
                     <a:stretch>
                       <a:fillRect/>
                     </a:stretch>
@@ -147,6 +785,7 @@
       </w:pPr>
       <w:r>
         <w:rPr>
+          <w:noProof/>
           <w:lang w:val="en-US"/>
         </w:rPr>
         <w:drawing>
@@ -165,7 +804,7 @@
                     <pic:cNvPicPr/>
                   </pic:nvPicPr>
                   <pic:blipFill>
-                    <a:blip r:embed="rId8"/>
+                    <a:blip r:embed="rId17"/>
                     <a:stretch>
                       <a:fillRect/>
                     </a:stretch>
@@ -201,6 +840,103 @@
     </w:sectPr>
   </w:body>
 </w:document>
+</file>
+
+<file path=word/numbering.xml><?xml version="1.0" encoding="utf-8"?>
+<w:numbering xmlns:wpc="http://schemas.microsoft.com/office/word/2010/wordprocessingCanvas" xmlns:cx="http://schemas.microsoft.com/office/drawing/2014/chartex" xmlns:cx1="http://schemas.microsoft.com/office/drawing/2015/9/8/chartex" xmlns:cx2="http://schemas.microsoft.com/office/drawing/2015/10/21/chartex" xmlns:cx3="http://schemas.microsoft.com/office/drawing/2016/5/9/chartex" xmlns:cx4="http://schemas.microsoft.com/office/drawing/2016/5/10/chartex" xmlns:cx5="http://schemas.microsoft.com/office/drawing/2016/5/11/chartex" xmlns:cx6="http://schemas.microsoft.com/office/drawing/2016/5/12/chartex" xmlns:cx7="http://schemas.microsoft.com/office/drawing/2016/5/13/chartex" xmlns:cx8="http://schemas.microsoft.com/office/drawing/2016/5/14/chartex" xmlns:mc="http://schemas.openxmlformats.org/markup-compatibility/2006" xmlns:aink="http://schemas.microsoft.com/office/drawing/2016/ink" xmlns:am3d="http://schemas.microsoft.com/office/drawing/2017/model3d" xmlns:o="urn:schemas-microsoft-com:office:office" xmlns:oel="http://schemas.microsoft.com/office/2019/extlst" xmlns:r="http://schemas.openxmlformats.org/officeDocument/2006/relationships" xmlns:m="http://schemas.openxmlformats.org/officeDocument/2006/math" xmlns:v="urn:schemas-microsoft-com:vml" xmlns:wp14="http://schemas.microsoft.com/office/word/2010/wordprocessingDrawing" xmlns:wp="http://schemas.openxmlformats.org/drawingml/2006/wordprocessingDrawing" xmlns:w10="urn:schemas-microsoft-com:office:word" xmlns:w="http://schemas.openxmlformats.org/wordprocessingml/2006/main" xmlns:w14="http://schemas.microsoft.com/office/word/2010/wordml" xmlns:w15="http://schemas.microsoft.com/office/word/2012/wordml" xmlns:w16cex="http://schemas.microsoft.com/office/word/2018/wordml/cex" xmlns:w16cid="http://schemas.microsoft.com/office/word/2016/wordml/cid" xmlns:w16="http://schemas.microsoft.com/office/word/2018/wordml" xmlns:w16du="http://schemas.microsoft.com/office/word/2023/wordml/word16du" xmlns:w16sdtdh="http://schemas.microsoft.com/office/word/2020/wordml/sdtdatahash" xmlns:w16sdtfl="http://schemas.microsoft.com/office/word/2024/wordml/sdtformatlock" xmlns:w16se="http://schemas.microsoft.com/office/word/2015/wordml/symex" xmlns:wpg="http://schemas.microsoft.com/office/word/2010/wordprocessingGroup" xmlns:wpi="http://schemas.microsoft.com/office/word/2010/wordprocessingInk" xmlns:wne="http://schemas.microsoft.com/office/word/2006/wordml" xmlns:wps="http://schemas.microsoft.com/office/word/2010/wordprocessingShape" mc:Ignorable="w14 w15 w16se w16cid w16 w16cex w16sdtdh w16sdtfl w16du wp14">
+  <w:abstractNum w:abstractNumId="0" w15:restartNumberingAfterBreak="0">
+    <w:nsid w:val="644D246B"/>
+    <w:multiLevelType w:val="hybridMultilevel"/>
+    <w:tmpl w:val="EDA6B120"/>
+    <w:lvl w:ilvl="0" w:tplc="4009000F">
+      <w:start w:val="1"/>
+      <w:numFmt w:val="decimal"/>
+      <w:lvlText w:val="%1."/>
+      <w:lvlJc w:val="left"/>
+      <w:pPr>
+        <w:ind w:left="720" w:hanging="360"/>
+      </w:pPr>
+      <w:rPr>
+        <w:rFonts w:hint="default"/>
+      </w:rPr>
+    </w:lvl>
+    <w:lvl w:ilvl="1" w:tplc="40090019" w:tentative="1">
+      <w:start w:val="1"/>
+      <w:numFmt w:val="lowerLetter"/>
+      <w:lvlText w:val="%2."/>
+      <w:lvlJc w:val="left"/>
+      <w:pPr>
+        <w:ind w:left="1440" w:hanging="360"/>
+      </w:pPr>
+    </w:lvl>
+    <w:lvl w:ilvl="2" w:tplc="4009001B" w:tentative="1">
+      <w:start w:val="1"/>
+      <w:numFmt w:val="lowerRoman"/>
+      <w:lvlText w:val="%3."/>
+      <w:lvlJc w:val="right"/>
+      <w:pPr>
+        <w:ind w:left="2160" w:hanging="180"/>
+      </w:pPr>
+    </w:lvl>
+    <w:lvl w:ilvl="3" w:tplc="4009000F" w:tentative="1">
+      <w:start w:val="1"/>
+      <w:numFmt w:val="decimal"/>
+      <w:lvlText w:val="%4."/>
+      <w:lvlJc w:val="left"/>
+      <w:pPr>
+        <w:ind w:left="2880" w:hanging="360"/>
+      </w:pPr>
+    </w:lvl>
+    <w:lvl w:ilvl="4" w:tplc="40090019" w:tentative="1">
+      <w:start w:val="1"/>
+      <w:numFmt w:val="lowerLetter"/>
+      <w:lvlText w:val="%5."/>
+      <w:lvlJc w:val="left"/>
+      <w:pPr>
+        <w:ind w:left="3600" w:hanging="360"/>
+      </w:pPr>
+    </w:lvl>
+    <w:lvl w:ilvl="5" w:tplc="4009001B" w:tentative="1">
+      <w:start w:val="1"/>
+      <w:numFmt w:val="lowerRoman"/>
+      <w:lvlText w:val="%6."/>
+      <w:lvlJc w:val="right"/>
+      <w:pPr>
+        <w:ind w:left="4320" w:hanging="180"/>
+      </w:pPr>
+    </w:lvl>
+    <w:lvl w:ilvl="6" w:tplc="4009000F" w:tentative="1">
+      <w:start w:val="1"/>
+      <w:numFmt w:val="decimal"/>
+      <w:lvlText w:val="%7."/>
+      <w:lvlJc w:val="left"/>
+      <w:pPr>
+        <w:ind w:left="5040" w:hanging="360"/>
+      </w:pPr>
+    </w:lvl>
+    <w:lvl w:ilvl="7" w:tplc="40090019" w:tentative="1">
+      <w:start w:val="1"/>
+      <w:numFmt w:val="lowerLetter"/>
+      <w:lvlText w:val="%8."/>
+      <w:lvlJc w:val="left"/>
+      <w:pPr>
+        <w:ind w:left="5760" w:hanging="360"/>
+      </w:pPr>
+    </w:lvl>
+    <w:lvl w:ilvl="8" w:tplc="4009001B" w:tentative="1">
+      <w:start w:val="1"/>
+      <w:numFmt w:val="lowerRoman"/>
+      <w:lvlText w:val="%9."/>
+      <w:lvlJc w:val="right"/>
+      <w:pPr>
+        <w:ind w:left="6480" w:hanging="180"/>
+      </w:pPr>
+    </w:lvl>
+  </w:abstractNum>
+  <w:num w:numId="1" w16cid:durableId="318273693">
+    <w:abstractNumId w:val="0"/>
+  </w:num>
+</w:numbering>
 </file>
 
 <file path=word/styles.xml><?xml version="1.0" encoding="utf-8"?>
@@ -806,6 +1542,7 @@
   <w:style w:type="character" w:default="1" w:styleId="DefaultParagraphFont">
     <w:name w:val="Default Paragraph Font"/>
     <w:uiPriority w:val="1"/>
+    <w:semiHidden/>
     <w:unhideWhenUsed/>
   </w:style>
   <w:style w:type="table" w:default="1" w:styleId="TableNormal">

</xml_diff>